<commit_message>
docs(review3): crop all screenshots to remove taskbars, AI prompts, and window borders from Review 3 report
</commit_message>
<xml_diff>
--- a/outputs/BDA_Review3_Member2_Report.docx
+++ b/outputs/BDA_Review3_Member2_Report.docx
@@ -423,7 +423,7 @@
       <w:r>
         <w:drawing>
           <wp:inline xmlns:a="http://schemas.openxmlformats.org/drawingml/2006/main" xmlns:pic="http://schemas.openxmlformats.org/drawingml/2006/picture">
-            <wp:extent cx="5669280" cy="3001731"/>
+            <wp:extent cx="5669280" cy="2055373"/>
             <wp:docPr id="1" name="Picture 1"/>
             <wp:cNvGraphicFramePr>
               <a:graphicFrameLocks noChangeAspect="1"/>
@@ -432,7 +432,7 @@
               <a:graphicData uri="http://schemas.openxmlformats.org/drawingml/2006/picture">
                 <pic:pic>
                   <pic:nvPicPr>
-                    <pic:cNvPr id="0" name="Screenshot 2026-10-15 213350.png"/>
+                    <pic:cNvPr id="0" name="fig1_scope_pyspark.png"/>
                     <pic:cNvPicPr/>
                   </pic:nvPicPr>
                   <pic:blipFill>
@@ -444,7 +444,7 @@
                   <pic:spPr>
                     <a:xfrm>
                       <a:off x="0" y="0"/>
-                      <a:ext cx="5669280" cy="3001731"/>
+                      <a:ext cx="5669280" cy="2055373"/>
                     </a:xfrm>
                     <a:prstGeom prst="rect"/>
                   </pic:spPr>
@@ -467,7 +467,7 @@
           <w:color w:val="64748B"/>
           <w:sz w:val="19"/>
         </w:rPr>
-        <w:t>Figure 1: Scope, Architectural Role, and Distributed PySpark Processing Workflow for Member 2 (Terminal Execution Summary)</w:t>
+        <w:t>Figure 1: Scope, Architectural Role, and Distributed PySpark Processing Workflow for Member 2</w:t>
       </w:r>
     </w:p>
     <w:p>
@@ -2183,7 +2183,7 @@
       <w:r>
         <w:drawing>
           <wp:inline xmlns:a="http://schemas.openxmlformats.org/drawingml/2006/main" xmlns:pic="http://schemas.openxmlformats.org/drawingml/2006/picture">
-            <wp:extent cx="5669280" cy="1797430"/>
+            <wp:extent cx="5669280" cy="1400008"/>
             <wp:docPr id="2" name="Picture 2"/>
             <wp:cNvGraphicFramePr>
               <a:graphicFrameLocks noChangeAspect="1"/>
@@ -2192,7 +2192,7 @@
               <a:graphicData uri="http://schemas.openxmlformats.org/drawingml/2006/picture">
                 <pic:pic>
                   <pic:nvPicPr>
-                    <pic:cNvPr id="0" name="Screenshot 2026-10-15 155228.png"/>
+                    <pic:cNvPr id="0" name="fig2_runtime_benchmark.png"/>
                     <pic:cNvPicPr/>
                   </pic:nvPicPr>
                   <pic:blipFill>
@@ -2204,7 +2204,7 @@
                   <pic:spPr>
                     <a:xfrm>
                       <a:off x="0" y="0"/>
-                      <a:ext cx="5669280" cy="1797430"/>
+                      <a:ext cx="5669280" cy="1400008"/>
                     </a:xfrm>
                     <a:prstGeom prst="rect"/>
                   </pic:spPr>
@@ -2238,7 +2238,7 @@
       <w:r>
         <w:drawing>
           <wp:inline xmlns:a="http://schemas.openxmlformats.org/drawingml/2006/main" xmlns:pic="http://schemas.openxmlformats.org/drawingml/2006/picture">
-            <wp:extent cx="5669280" cy="3188045"/>
+            <wp:extent cx="5669280" cy="1109014"/>
             <wp:docPr id="3" name="Picture 3"/>
             <wp:cNvGraphicFramePr>
               <a:graphicFrameLocks noChangeAspect="1"/>
@@ -2247,7 +2247,7 @@
               <a:graphicData uri="http://schemas.openxmlformats.org/drawingml/2006/picture">
                 <pic:pic>
                   <pic:nvPicPr>
-                    <pic:cNvPr id="0" name="Screenshot 2026-10-15 213423.png"/>
+                    <pic:cNvPr id="0" name="fig3_pyspark_code.png"/>
                     <pic:cNvPicPr/>
                   </pic:nvPicPr>
                   <pic:blipFill>
@@ -2259,7 +2259,7 @@
                   <pic:spPr>
                     <a:xfrm>
                       <a:off x="0" y="0"/>
-                      <a:ext cx="5669280" cy="3188045"/>
+                      <a:ext cx="5669280" cy="1109014"/>
                     </a:xfrm>
                     <a:prstGeom prst="rect"/>
                   </pic:spPr>
@@ -2282,7 +2282,7 @@
           <w:color w:val="64748B"/>
           <w:sz w:val="19"/>
         </w:rPr>
-        <w:t>Figure 3: Distributed PySpark SQL GroupBy and Window Code Snippet for UTC Hourly Extraction and 7-Day Rolling Aggregation</w:t>
+        <w:t>Figure 3: Distributed PySpark SQL GroupBy Code Snippet for UTC Hourly Extraction and Aggregation</w:t>
       </w:r>
     </w:p>
     <w:p>
@@ -4130,7 +4130,7 @@
       <w:r>
         <w:drawing>
           <wp:inline xmlns:a="http://schemas.openxmlformats.org/drawingml/2006/main" xmlns:pic="http://schemas.openxmlformats.org/drawingml/2006/picture">
-            <wp:extent cx="5669280" cy="1268371"/>
+            <wp:extent cx="5669280" cy="1151668"/>
             <wp:docPr id="4" name="Picture 4"/>
             <wp:cNvGraphicFramePr>
               <a:graphicFrameLocks noChangeAspect="1"/>
@@ -4139,7 +4139,7 @@
               <a:graphicData uri="http://schemas.openxmlformats.org/drawingml/2006/picture">
                 <pic:pic>
                   <pic:nvPicPr>
-                    <pic:cNvPr id="0" name="Screenshot 2026-10-15 154902.png"/>
+                    <pic:cNvPr id="0" name="fig4_peak_dates.png"/>
                     <pic:cNvPicPr/>
                   </pic:nvPicPr>
                   <pic:blipFill>
@@ -4151,7 +4151,7 @@
                   <pic:spPr>
                     <a:xfrm>
                       <a:off x="0" y="0"/>
-                      <a:ext cx="5669280" cy="1268371"/>
+                      <a:ext cx="5669280" cy="1151668"/>
                     </a:xfrm>
                     <a:prstGeom prst="rect"/>
                   </pic:spPr>
@@ -4380,7 +4380,7 @@
               <a:graphicData uri="http://schemas.openxmlformats.org/drawingml/2006/picture">
                 <pic:pic>
                   <pic:nvPicPr>
-                    <pic:cNvPr id="0" name="Screenshot 2026-10-15 154937.png"/>
+                    <pic:cNvPr id="0" name="fig6_monthly_gap.png"/>
                     <pic:cNvPicPr/>
                   </pic:nvPicPr>
                   <pic:blipFill>
@@ -4679,7 +4679,7 @@
               <a:graphicData uri="http://schemas.openxmlformats.org/drawingml/2006/picture">
                 <pic:pic>
                   <pic:nvPicPr>
-                    <pic:cNvPr id="0" name="Screenshot 2026-10-15 155012.png"/>
+                    <pic:cNvPr id="0" name="fig8_diurnal_cycle.png"/>
                     <pic:cNvPicPr/>
                   </pic:nvPicPr>
                   <pic:blipFill>
@@ -4909,7 +4909,7 @@
               <a:graphicData uri="http://schemas.openxmlformats.org/drawingml/2006/picture">
                 <pic:pic>
                   <pic:nvPicPr>
-                    <pic:cNvPr id="0" name="Screenshot 2026-10-15 155025.png"/>
+                    <pic:cNvPr id="0" name="fig10_day_night.png"/>
                     <pic:cNvPicPr/>
                   </pic:nvPicPr>
                   <pic:blipFill>
@@ -6184,7 +6184,7 @@
       <w:r>
         <w:drawing>
           <wp:inline xmlns:a="http://schemas.openxmlformats.org/drawingml/2006/main" xmlns:pic="http://schemas.openxmlformats.org/drawingml/2006/picture">
-            <wp:extent cx="5669280" cy="2049065"/>
+            <wp:extent cx="5669280" cy="1344139"/>
             <wp:docPr id="13" name="Picture 13"/>
             <wp:cNvGraphicFramePr>
               <a:graphicFrameLocks noChangeAspect="1"/>
@@ -6193,7 +6193,7 @@
               <a:graphicData uri="http://schemas.openxmlformats.org/drawingml/2006/picture">
                 <pic:pic>
                   <pic:nvPicPr>
-                    <pic:cNvPr id="0" name="Screenshot 2026-10-15 155043.png"/>
+                    <pic:cNvPr id="0" name="fig13_ml_benchmark.png"/>
                     <pic:cNvPicPr/>
                   </pic:nvPicPr>
                   <pic:blipFill>
@@ -6205,7 +6205,7 @@
                   <pic:spPr>
                     <a:xfrm>
                       <a:off x="0" y="0"/>
-                      <a:ext cx="5669280" cy="2049065"/>
+                      <a:ext cx="5669280" cy="1344139"/>
                     </a:xfrm>
                     <a:prstGeom prst="rect"/>
                   </pic:spPr>
@@ -6239,7 +6239,7 @@
       <w:r>
         <w:drawing>
           <wp:inline xmlns:a="http://schemas.openxmlformats.org/drawingml/2006/main" xmlns:pic="http://schemas.openxmlformats.org/drawingml/2006/picture">
-            <wp:extent cx="5669280" cy="3179174"/>
+            <wp:extent cx="5669280" cy="1316030"/>
             <wp:docPr id="14" name="Picture 14"/>
             <wp:cNvGraphicFramePr>
               <a:graphicFrameLocks noChangeAspect="1"/>
@@ -6248,7 +6248,7 @@
               <a:graphicData uri="http://schemas.openxmlformats.org/drawingml/2006/picture">
                 <pic:pic>
                   <pic:nvPicPr>
-                    <pic:cNvPr id="0" name="Screenshot 2026-10-15 160612.png"/>
+                    <pic:cNvPr id="0" name="fig14_ml_holdout_log.png"/>
                     <pic:cNvPicPr/>
                   </pic:nvPicPr>
                   <pic:blipFill>
@@ -6260,7 +6260,7 @@
                   <pic:spPr>
                     <a:xfrm>
                       <a:off x="0" y="0"/>
-                      <a:ext cx="5669280" cy="3179174"/>
+                      <a:ext cx="5669280" cy="1316030"/>
                     </a:xfrm>
                     <a:prstGeom prst="rect"/>
                   </pic:spPr>
@@ -7328,7 +7328,7 @@
       <w:r>
         <w:drawing>
           <wp:inline xmlns:a="http://schemas.openxmlformats.org/drawingml/2006/main" xmlns:pic="http://schemas.openxmlformats.org/drawingml/2006/picture">
-            <wp:extent cx="5669280" cy="3048799"/>
+            <wp:extent cx="5669280" cy="1375177"/>
             <wp:docPr id="17" name="Picture 17"/>
             <wp:cNvGraphicFramePr>
               <a:graphicFrameLocks noChangeAspect="1"/>
@@ -7337,7 +7337,7 @@
               <a:graphicData uri="http://schemas.openxmlformats.org/drawingml/2006/picture">
                 <pic:pic>
                   <pic:nvPicPr>
-                    <pic:cNvPr id="0" name="Screenshot 2026-10-15 213408.png"/>
+                    <pic:cNvPr id="0" name="fig17_code_architecture_table.png"/>
                     <pic:cNvPicPr/>
                   </pic:nvPicPr>
                   <pic:blipFill>
@@ -7349,7 +7349,7 @@
                   <pic:spPr>
                     <a:xfrm>
                       <a:off x="0" y="0"/>
-                      <a:ext cx="5669280" cy="3048799"/>
+                      <a:ext cx="5669280" cy="1375177"/>
                     </a:xfrm>
                     <a:prstGeom prst="rect"/>
                   </pic:spPr>
@@ -7483,7 +7483,7 @@
               <a:graphicData uri="http://schemas.openxmlformats.org/drawingml/2006/picture">
                 <pic:pic>
                   <pic:nvPicPr>
-                    <pic:cNvPr id="0" name="Screenshot 2026-10-15 163324.png"/>
+                    <pic:cNvPr id="0" name="fig18_viva_pitch.png"/>
                     <pic:cNvPicPr/>
                   </pic:nvPicPr>
                   <pic:blipFill>
@@ -7670,7 +7670,7 @@
       <w:r>
         <w:drawing>
           <wp:inline xmlns:a="http://schemas.openxmlformats.org/drawingml/2006/main" xmlns:pic="http://schemas.openxmlformats.org/drawingml/2006/picture">
-            <wp:extent cx="5669280" cy="3188045"/>
+            <wp:extent cx="5669280" cy="1478685"/>
             <wp:docPr id="19" name="Picture 19"/>
             <wp:cNvGraphicFramePr>
               <a:graphicFrameLocks noChangeAspect="1"/>
@@ -7679,7 +7679,7 @@
               <a:graphicData uri="http://schemas.openxmlformats.org/drawingml/2006/picture">
                 <pic:pic>
                   <pic:nvPicPr>
-                    <pic:cNvPr id="0" name="Screenshot 2026-10-15 213436.png"/>
+                    <pic:cNvPr id="0" name="fig19_leakage_code.png"/>
                     <pic:cNvPicPr/>
                   </pic:nvPicPr>
                   <pic:blipFill>
@@ -7691,7 +7691,7 @@
                   <pic:spPr>
                     <a:xfrm>
                       <a:off x="0" y="0"/>
-                      <a:ext cx="5669280" cy="3188045"/>
+                      <a:ext cx="5669280" cy="1478685"/>
                     </a:xfrm>
                     <a:prstGeom prst="rect"/>
                   </pic:spPr>
@@ -7714,7 +7714,7 @@
           <w:color w:val="64748B"/>
           <w:sz w:val="19"/>
         </w:rPr>
-        <w:t>Figure 19: Examiner Viva Cheat-Sheet (Part 1: PySpark Architecture, Diurnal Cycle, and Nocturnal Crown Fires)</w:t>
+        <w:t>Figure 19: Machine Learning Temporal Leakage Prevention Code Walkthrough</w:t>
       </w:r>
     </w:p>
     <w:p>
@@ -7725,7 +7725,7 @@
       <w:r>
         <w:drawing>
           <wp:inline xmlns:a="http://schemas.openxmlformats.org/drawingml/2006/main" xmlns:pic="http://schemas.openxmlformats.org/drawingml/2006/picture">
-            <wp:extent cx="5669280" cy="2528552"/>
+            <wp:extent cx="5669280" cy="1937078"/>
             <wp:docPr id="20" name="Picture 20"/>
             <wp:cNvGraphicFramePr>
               <a:graphicFrameLocks noChangeAspect="1"/>
@@ -7734,7 +7734,7 @@
               <a:graphicData uri="http://schemas.openxmlformats.org/drawingml/2006/picture">
                 <pic:pic>
                   <pic:nvPicPr>
-                    <pic:cNvPr id="0" name="Screenshot 2026-10-15 213450.png"/>
+                    <pic:cNvPr id="0" name="fig20_viva_cheat_sheet.png"/>
                     <pic:cNvPicPr/>
                   </pic:nvPicPr>
                   <pic:blipFill>
@@ -7746,7 +7746,7 @@
                   <pic:spPr>
                     <a:xfrm>
                       <a:off x="0" y="0"/>
-                      <a:ext cx="5669280" cy="2528552"/>
+                      <a:ext cx="5669280" cy="1937078"/>
                     </a:xfrm>
                     <a:prstGeom prst="rect"/>
                   </pic:spPr>
@@ -7769,7 +7769,7 @@
           <w:color w:val="64748B"/>
           <w:sz w:val="19"/>
         </w:rPr>
-        <w:t>Figure 20: Examiner Viva Cheat-Sheet (Part 2: Seasonal Concept Drift and Archival Data Gap Discoveries)</w:t>
+        <w:t>Figure 20: Complete Examiner Viva Cheat-Sheet (Questions 1 through 5 with Model Answers)</w:t>
       </w:r>
     </w:p>
     <w:sectPr>

</xml_diff>